<commit_message>
feat: final dissertation report
</commit_message>
<xml_diff>
--- a/Predictive_CI_CD_Reliability_Project_Outline.docx
+++ b/Predictive_CI_CD_Reliability_Project_Outline.docx
@@ -2,20 +2,6 @@
 <file path=word/document.xml><?xml version="1.0" encoding="utf-8"?>
 <w:document xmlns:wpc="http://schemas.microsoft.com/office/word/2010/wordprocessingCanvas" xmlns:cx="http://schemas.microsoft.com/office/drawing/2014/chartex" xmlns:cx1="http://schemas.microsoft.com/office/drawing/2015/9/8/chartex" xmlns:cx2="http://schemas.microsoft.com/office/drawing/2015/10/21/chartex" xmlns:cx3="http://schemas.microsoft.com/office/drawing/2016/5/9/chartex" xmlns:cx4="http://schemas.microsoft.com/office/drawing/2016/5/10/chartex" xmlns:cx5="http://schemas.microsoft.com/office/drawing/2016/5/11/chartex" xmlns:cx6="http://schemas.microsoft.com/office/drawing/2016/5/12/chartex" xmlns:cx7="http://schemas.microsoft.com/office/drawing/2016/5/13/chartex" xmlns:cx8="http://schemas.microsoft.com/office/drawing/2016/5/14/chartex" xmlns:mc="http://schemas.openxmlformats.org/markup-compatibility/2006" xmlns:aink="http://schemas.microsoft.com/office/drawing/2016/ink" xmlns:am3d="http://schemas.microsoft.com/office/drawing/2017/model3d" xmlns:o="urn:schemas-microsoft-com:office:office" xmlns:oel="http://schemas.microsoft.com/office/2019/extlst" xmlns:r="http://schemas.openxmlformats.org/officeDocument/2006/relationships" xmlns:m="http://schemas.openxmlformats.org/officeDocument/2006/math" xmlns:v="urn:schemas-microsoft-com:vml" xmlns:wp14="http://schemas.microsoft.com/office/word/2010/wordprocessingDrawing" xmlns:wp="http://schemas.openxmlformats.org/drawingml/2006/wordprocessingDrawing" xmlns:w10="urn:schemas-microsoft-com:office:word" xmlns:w="http://schemas.openxmlformats.org/wordprocessingml/2006/main" xmlns:w14="http://schemas.microsoft.com/office/word/2010/wordml" xmlns:w15="http://schemas.microsoft.com/office/word/2012/wordml" xmlns:w16cex="http://schemas.microsoft.com/office/word/2018/wordml/cex" xmlns:w16cid="http://schemas.microsoft.com/office/word/2016/wordml/cid" xmlns:w16="http://schemas.microsoft.com/office/word/2018/wordml" xmlns:w16du="http://schemas.microsoft.com/office/word/2023/wordml/word16du" xmlns:w16sdtdh="http://schemas.microsoft.com/office/word/2020/wordml/sdtdatahash" xmlns:w16sdtfl="http://schemas.microsoft.com/office/word/2024/wordml/sdtformatlock" xmlns:w16se="http://schemas.microsoft.com/office/word/2015/wordml/symex" xmlns:wpg="http://schemas.microsoft.com/office/word/2010/wordprocessingGroup" xmlns:wpi="http://schemas.microsoft.com/office/word/2010/wordprocessingInk" xmlns:wne="http://schemas.microsoft.com/office/word/2006/wordml" xmlns:wps="http://schemas.microsoft.com/office/word/2010/wordprocessingShape" mc:Ignorable="w14 w15 w16se w16cid w16 w16cex w16sdtdh w16sdtfl w16du wp14">
   <w:body>
-    <w:p>
-      <w:pPr>
-        <w:spacing w:before="1040"/>
-        <w:jc w:val="center"/>
-      </w:pPr>
-      <w:r>
-        <w:rPr>
-          <w:b/>
-          <w:color w:val="2F5597"/>
-          <w:sz w:val="28"/>
-        </w:rPr>
-        <w:t>DISSERTATION / PROJECT / PROJECT WORK OUTLINE</w:t>
-      </w:r>
-    </w:p>
     <w:p>
       <w:pPr>
         <w:pStyle w:val="Title"/>
@@ -74,7 +60,7 @@
           <w:sz w:val="28"/>
           <w:szCs w:val="28"/>
         </w:rPr>
-        <w:t>(Insert Course No.)</w:t>
+        <w:t>S1-26_SSWTZG628T</w:t>
       </w:r>
     </w:p>
     <w:p>
@@ -99,7 +85,28 @@
           <w:sz w:val="28"/>
           <w:szCs w:val="28"/>
         </w:rPr>
-        <w:t>Dissertation / Project / Project Work</w:t>
+        <w:t>Dissertation</w:t>
+      </w:r>
+    </w:p>
+    <w:p>
+      <w:pPr>
+        <w:spacing w:before="120"/>
+        <w:jc w:val="center"/>
+        <w:rPr>
+          <w:b/>
+          <w:bCs/>
+          <w:sz w:val="28"/>
+          <w:szCs w:val="28"/>
+        </w:rPr>
+      </w:pPr>
+      <w:r>
+        <w:rPr>
+          <w:b/>
+          <w:bCs/>
+          <w:sz w:val="28"/>
+          <w:szCs w:val="28"/>
+        </w:rPr>
+        <w:t>Dissertation Done By:</w:t>
       </w:r>
     </w:p>
     <w:p>
@@ -124,7 +131,14 @@
           <w:sz w:val="28"/>
           <w:szCs w:val="28"/>
         </w:rPr>
-        <w:t>(Insert Student Name)</w:t>
+        <w:t>B</w:t>
+      </w:r>
+      <w:r>
+        <w:rPr>
+          <w:sz w:val="28"/>
+          <w:szCs w:val="28"/>
+        </w:rPr>
+        <w:t>hagyashri Kiran Bhat</w:t>
       </w:r>
     </w:p>
     <w:p>
@@ -149,7 +163,7 @@
           <w:sz w:val="28"/>
           <w:szCs w:val="28"/>
         </w:rPr>
-        <w:t>(Insert Student ID)</w:t>
+        <w:t>2022wc15160</w:t>
       </w:r>
     </w:p>
     <w:p>
@@ -174,7 +188,7 @@
           <w:sz w:val="28"/>
           <w:szCs w:val="28"/>
         </w:rPr>
-        <w:t>(Insert Degree Name)</w:t>
+        <w:t>MTech - Integrated Software Systems - WIPRO TECHNOLOGIES (WASE)</w:t>
       </w:r>
     </w:p>
     <w:p>
@@ -199,7 +213,7 @@
           <w:sz w:val="28"/>
           <w:szCs w:val="28"/>
         </w:rPr>
-        <w:t>Machine Learning for Software Engineering (CI/CD Analytics)</w:t>
+        <w:t>Machine Learning</w:t>
       </w:r>
     </w:p>
     <w:p>
@@ -217,14 +231,22 @@
           <w:sz w:val="28"/>
           <w:szCs w:val="28"/>
         </w:rPr>
-        <w:t xml:space="preserve">Project carried out at: </w:t>
+        <w:t xml:space="preserve">Dissertation </w:t>
+      </w:r>
+      <w:r>
+        <w:rPr>
+          <w:b/>
+          <w:sz w:val="28"/>
+          <w:szCs w:val="28"/>
+        </w:rPr>
+        <w:t xml:space="preserve">carried out at: </w:t>
       </w:r>
       <w:r>
         <w:rPr>
           <w:sz w:val="28"/>
           <w:szCs w:val="28"/>
         </w:rPr>
-        <w:t>(Insert Organization Name &amp; Location)</w:t>
+        <w:t>Wipro Technologies, Pune</w:t>
       </w:r>
     </w:p>
     <w:p>
@@ -301,6 +323,8 @@
         <w:spacing w:before="560"/>
         <w:jc w:val="center"/>
         <w:rPr>
+          <w:b/>
+          <w:color w:val="2F5597"/>
           <w:sz w:val="32"/>
           <w:szCs w:val="32"/>
         </w:rPr>
@@ -313,6 +337,24 @@
           <w:szCs w:val="32"/>
         </w:rPr>
         <w:t>BIRLA INSTITUTE OF TECHNOLOGY AND SCIENCE, PILANI</w:t>
+      </w:r>
+      <w:r>
+        <w:rPr>
+          <w:b/>
+          <w:color w:val="2F5597"/>
+          <w:sz w:val="32"/>
+          <w:szCs w:val="32"/>
+        </w:rPr>
+        <w:br/>
+      </w:r>
+      <w:r>
+        <w:rPr>
+          <w:b/>
+          <w:color w:val="2F5597"/>
+          <w:sz w:val="32"/>
+          <w:szCs w:val="32"/>
+        </w:rPr>
+        <w:t>VIDYA VIHAR, PILANI, RAJASTHAN - 333031</w:t>
       </w:r>
     </w:p>
     <w:p>
@@ -396,7 +438,7 @@
           <w:r>
             <w:fldChar w:fldCharType="separate"/>
           </w:r>
-          <w:hyperlink w:anchor="_Toc244019672" w:history="1">
+          <w:hyperlink w:anchor="_Toc244097714" w:history="1">
             <w:r>
               <w:rPr>
                 <w:rStyle w:val="Hyperlink"/>
@@ -423,7 +465,7 @@
                 <w:noProof/>
                 <w:webHidden/>
               </w:rPr>
-              <w:instrText xml:space="preserve"> PAGEREF _Toc244019672 \h </w:instrText>
+              <w:instrText xml:space="preserve"> PAGEREF _Toc244097714 \h </w:instrText>
             </w:r>
             <w:r>
               <w:rPr>
@@ -468,7 +510,7 @@
               <w14:ligatures w14:val="standardContextual"/>
             </w:rPr>
           </w:pPr>
-          <w:hyperlink w:anchor="_Toc244019673" w:history="1">
+          <w:hyperlink w:anchor="_Toc244097715" w:history="1">
             <w:r>
               <w:rPr>
                 <w:rStyle w:val="Hyperlink"/>
@@ -495,7 +537,7 @@
                 <w:noProof/>
                 <w:webHidden/>
               </w:rPr>
-              <w:instrText xml:space="preserve"> PAGEREF _Toc244019673 \h </w:instrText>
+              <w:instrText xml:space="preserve"> PAGEREF _Toc244097715 \h </w:instrText>
             </w:r>
             <w:r>
               <w:rPr>
@@ -540,7 +582,7 @@
               <w14:ligatures w14:val="standardContextual"/>
             </w:rPr>
           </w:pPr>
-          <w:hyperlink w:anchor="_Toc244019674" w:history="1">
+          <w:hyperlink w:anchor="_Toc244097716" w:history="1">
             <w:r>
               <w:rPr>
                 <w:rStyle w:val="Hyperlink"/>
@@ -567,7 +609,7 @@
                 <w:noProof/>
                 <w:webHidden/>
               </w:rPr>
-              <w:instrText xml:space="preserve"> PAGEREF _Toc244019674 \h </w:instrText>
+              <w:instrText xml:space="preserve"> PAGEREF _Toc244097716 \h </w:instrText>
             </w:r>
             <w:r>
               <w:rPr>
@@ -612,7 +654,7 @@
               <w14:ligatures w14:val="standardContextual"/>
             </w:rPr>
           </w:pPr>
-          <w:hyperlink w:anchor="_Toc244019675" w:history="1">
+          <w:hyperlink w:anchor="_Toc244097717" w:history="1">
             <w:r>
               <w:rPr>
                 <w:rStyle w:val="Hyperlink"/>
@@ -639,7 +681,7 @@
                 <w:noProof/>
                 <w:webHidden/>
               </w:rPr>
-              <w:instrText xml:space="preserve"> PAGEREF _Toc244019675 \h </w:instrText>
+              <w:instrText xml:space="preserve"> PAGEREF _Toc244097717 \h </w:instrText>
             </w:r>
             <w:r>
               <w:rPr>
@@ -684,7 +726,7 @@
               <w14:ligatures w14:val="standardContextual"/>
             </w:rPr>
           </w:pPr>
-          <w:hyperlink w:anchor="_Toc244019676" w:history="1">
+          <w:hyperlink w:anchor="_Toc244097718" w:history="1">
             <w:r>
               <w:rPr>
                 <w:rStyle w:val="Hyperlink"/>
@@ -711,7 +753,7 @@
                 <w:noProof/>
                 <w:webHidden/>
               </w:rPr>
-              <w:instrText xml:space="preserve"> PAGEREF _Toc244019676 \h </w:instrText>
+              <w:instrText xml:space="preserve"> PAGEREF _Toc244097718 \h </w:instrText>
             </w:r>
             <w:r>
               <w:rPr>
@@ -756,7 +798,7 @@
               <w14:ligatures w14:val="standardContextual"/>
             </w:rPr>
           </w:pPr>
-          <w:hyperlink w:anchor="_Toc244019677" w:history="1">
+          <w:hyperlink w:anchor="_Toc244097719" w:history="1">
             <w:r>
               <w:rPr>
                 <w:rStyle w:val="Hyperlink"/>
@@ -783,7 +825,7 @@
                 <w:noProof/>
                 <w:webHidden/>
               </w:rPr>
-              <w:instrText xml:space="preserve"> PAGEREF _Toc244019677 \h </w:instrText>
+              <w:instrText xml:space="preserve"> PAGEREF _Toc244097719 \h </w:instrText>
             </w:r>
             <w:r>
               <w:rPr>
@@ -828,13 +870,13 @@
               <w14:ligatures w14:val="standardContextual"/>
             </w:rPr>
           </w:pPr>
-          <w:hyperlink w:anchor="_Toc244019678" w:history="1">
+          <w:hyperlink w:anchor="_Toc244097720" w:history="1">
             <w:r>
               <w:rPr>
                 <w:rStyle w:val="Hyperlink"/>
                 <w:noProof/>
               </w:rPr>
-              <w:t>7. Particulars of the Supervisor and the Examiner</w:t>
+              <w:t>7. Particulars of the Supervisor and Examiner</w:t>
             </w:r>
             <w:r>
               <w:rPr>
@@ -855,7 +897,7 @@
                 <w:noProof/>
                 <w:webHidden/>
               </w:rPr>
-              <w:instrText xml:space="preserve"> PAGEREF _Toc244019678 \h </w:instrText>
+              <w:instrText xml:space="preserve"> PAGEREF _Toc244097720 \h </w:instrText>
             </w:r>
             <w:r>
               <w:rPr>
@@ -900,7 +942,7 @@
               <w14:ligatures w14:val="standardContextual"/>
             </w:rPr>
           </w:pPr>
-          <w:hyperlink w:anchor="_Toc244019679" w:history="1">
+          <w:hyperlink w:anchor="_Toc244097721" w:history="1">
             <w:r>
               <w:rPr>
                 <w:rStyle w:val="Hyperlink"/>
@@ -927,7 +969,7 @@
                 <w:noProof/>
                 <w:webHidden/>
               </w:rPr>
-              <w:instrText xml:space="preserve"> PAGEREF _Toc244019679 \h </w:instrText>
+              <w:instrText xml:space="preserve"> PAGEREF _Toc244097721 \h </w:instrText>
             </w:r>
             <w:r>
               <w:rPr>
@@ -986,7 +1028,7 @@
       <w:pPr>
         <w:pStyle w:val="Heading1"/>
       </w:pPr>
-      <w:bookmarkStart w:id="0" w:name="_Toc244019672"/>
+      <w:bookmarkStart w:id="0" w:name="_Toc244097714"/>
       <w:r>
         <w:lastRenderedPageBreak/>
         <w:t>1. Broad Area of Work</w:t>
@@ -1034,7 +1076,7 @@
       <w:pPr>
         <w:pStyle w:val="Heading1"/>
       </w:pPr>
-      <w:bookmarkStart w:id="1" w:name="_Toc244019673"/>
+      <w:bookmarkStart w:id="1" w:name="_Toc244097715"/>
       <w:r>
         <w:t>2. Background</w:t>
       </w:r>
@@ -1042,7 +1084,19 @@
     </w:p>
     <w:p>
       <w:r>
-        <w:t>Teams that practise CI trigger automated build and test workflows on every commit. When a workflow fails, developers wait longer for feedback, compute resources are consumed and work is blocked until the cause is found (Hilton et al., 2016). If the risk of failure could be estimated before a workflow runs, reviewers and pipeline owners could direct attention to the riskiest runs first. This is relevant to any organization that depends on automated pipelines for delivery, where late-detected failures slow releases and increase cost.</w:t>
+        <w:t xml:space="preserve">Teams that </w:t>
+      </w:r>
+      <w:r>
+        <w:t>practice</w:t>
+      </w:r>
+      <w:r>
+        <w:t xml:space="preserve"> CI trigger automated build and test workflows on every commit. When a workflow fails, developers wait longer for feedback, compute resources are consumed and work is blocked until the cause is found (Hilton et al., 2016). If the risk of failure could be estimated before a workflow runs, reviewers and pipeline owners could direct attention to the riskiest runs first. This is relevant to any organization that depends on automated pipelines for delivery, where </w:t>
+      </w:r>
+      <w:r>
+        <w:t>late detected</w:t>
+      </w:r>
+      <w:r>
+        <w:t xml:space="preserve"> failures slow releases and increase cost.</w:t>
       </w:r>
     </w:p>
     <w:p>
@@ -1075,7 +1129,7 @@
       <w:pPr>
         <w:pStyle w:val="Heading1"/>
       </w:pPr>
-      <w:bookmarkStart w:id="2" w:name="_Toc244019674"/>
+      <w:bookmarkStart w:id="2" w:name="_Toc244097716"/>
       <w:r>
         <w:lastRenderedPageBreak/>
         <w:t>3. Objectives</w:t>
@@ -1131,7 +1185,7 @@
       <w:pPr>
         <w:pStyle w:val="Heading1"/>
       </w:pPr>
-      <w:bookmarkStart w:id="3" w:name="_Toc244019675"/>
+      <w:bookmarkStart w:id="3" w:name="_Toc244097717"/>
       <w:r>
         <w:t>4. Scope of Work</w:t>
       </w:r>
@@ -1172,7 +1226,7 @@
       <w:pPr>
         <w:pStyle w:val="Heading1"/>
       </w:pPr>
-      <w:bookmarkStart w:id="4" w:name="_Toc244019676"/>
+      <w:bookmarkStart w:id="4" w:name="_Toc244097718"/>
       <w:r>
         <w:lastRenderedPageBreak/>
         <w:t>5. Plan of Work</w:t>
@@ -1307,7 +1361,31 @@
               <w:rPr>
                 <w:szCs w:val="24"/>
               </w:rPr>
-              <w:t>2 Nov 2026 – 15 Nov 2026</w:t>
+              <w:t>0</w:t>
+            </w:r>
+            <w:r>
+              <w:rPr>
+                <w:szCs w:val="24"/>
+              </w:rPr>
+              <w:t xml:space="preserve">2 Nov 2026 – </w:t>
+            </w:r>
+            <w:r>
+              <w:rPr>
+                <w:szCs w:val="24"/>
+              </w:rPr>
+              <w:t>0</w:t>
+            </w:r>
+            <w:r>
+              <w:rPr>
+                <w:szCs w:val="24"/>
+              </w:rPr>
+              <w:t>8</w:t>
+            </w:r>
+            <w:r>
+              <w:rPr>
+                <w:szCs w:val="24"/>
+              </w:rPr>
+              <w:t xml:space="preserve"> Nov 2026</w:t>
             </w:r>
           </w:p>
         </w:tc>
@@ -1373,7 +1451,31 @@
               <w:rPr>
                 <w:szCs w:val="24"/>
               </w:rPr>
-              <w:t>16 Nov 2026 – 29 Nov 2026</w:t>
+              <w:t>09</w:t>
+            </w:r>
+            <w:r>
+              <w:rPr>
+                <w:szCs w:val="24"/>
+              </w:rPr>
+              <w:t xml:space="preserve"> Nov 2026 – </w:t>
+            </w:r>
+            <w:r>
+              <w:rPr>
+                <w:szCs w:val="24"/>
+              </w:rPr>
+              <w:t>2</w:t>
+            </w:r>
+            <w:r>
+              <w:rPr>
+                <w:szCs w:val="24"/>
+              </w:rPr>
+              <w:t>2</w:t>
+            </w:r>
+            <w:r>
+              <w:rPr>
+                <w:szCs w:val="24"/>
+              </w:rPr>
+              <w:t xml:space="preserve"> Nov 2026</w:t>
             </w:r>
           </w:p>
         </w:tc>
@@ -1440,7 +1542,31 @@
               <w:rPr>
                 <w:szCs w:val="24"/>
               </w:rPr>
-              <w:t>30 Nov 2026 – 13 Dec 2026</w:t>
+              <w:t>23</w:t>
+            </w:r>
+            <w:r>
+              <w:rPr>
+                <w:szCs w:val="24"/>
+              </w:rPr>
+              <w:t xml:space="preserve"> Nov 2026 – </w:t>
+            </w:r>
+            <w:r>
+              <w:rPr>
+                <w:szCs w:val="24"/>
+              </w:rPr>
+              <w:t>0</w:t>
+            </w:r>
+            <w:r>
+              <w:rPr>
+                <w:szCs w:val="24"/>
+              </w:rPr>
+              <w:t>6</w:t>
+            </w:r>
+            <w:r>
+              <w:rPr>
+                <w:szCs w:val="24"/>
+              </w:rPr>
+              <w:t xml:space="preserve"> Dec 2026</w:t>
             </w:r>
           </w:p>
         </w:tc>
@@ -1506,7 +1632,31 @@
               <w:rPr>
                 <w:szCs w:val="24"/>
               </w:rPr>
-              <w:t>14 Dec 2026 – 27 Dec 2026</w:t>
+              <w:t>0</w:t>
+            </w:r>
+            <w:r>
+              <w:rPr>
+                <w:szCs w:val="24"/>
+              </w:rPr>
+              <w:t>7</w:t>
+            </w:r>
+            <w:r>
+              <w:rPr>
+                <w:szCs w:val="24"/>
+              </w:rPr>
+              <w:t xml:space="preserve"> Dec 2026 – 2</w:t>
+            </w:r>
+            <w:r>
+              <w:rPr>
+                <w:szCs w:val="24"/>
+              </w:rPr>
+              <w:t>0</w:t>
+            </w:r>
+            <w:r>
+              <w:rPr>
+                <w:szCs w:val="24"/>
+              </w:rPr>
+              <w:t xml:space="preserve"> Dec 2026</w:t>
             </w:r>
           </w:p>
         </w:tc>
@@ -1573,7 +1723,31 @@
               <w:rPr>
                 <w:szCs w:val="24"/>
               </w:rPr>
-              <w:t>28 Dec 2026 – 3 Jan 2027</w:t>
+              <w:t>2</w:t>
+            </w:r>
+            <w:r>
+              <w:rPr>
+                <w:szCs w:val="24"/>
+              </w:rPr>
+              <w:t>1</w:t>
+            </w:r>
+            <w:r>
+              <w:rPr>
+                <w:szCs w:val="24"/>
+              </w:rPr>
+              <w:t xml:space="preserve"> Dec 2026 – </w:t>
+            </w:r>
+            <w:r>
+              <w:rPr>
+                <w:szCs w:val="24"/>
+              </w:rPr>
+              <w:t xml:space="preserve">27 Dec </w:t>
+            </w:r>
+            <w:r>
+              <w:rPr>
+                <w:szCs w:val="24"/>
+              </w:rPr>
+              <w:t>2027</w:t>
             </w:r>
           </w:p>
         </w:tc>
@@ -1639,7 +1813,31 @@
               <w:rPr>
                 <w:szCs w:val="24"/>
               </w:rPr>
-              <w:t>4 Jan 2027 – 24 Jan 2027</w:t>
+              <w:t>28 Dec</w:t>
+            </w:r>
+            <w:r>
+              <w:rPr>
+                <w:szCs w:val="24"/>
+              </w:rPr>
+              <w:t xml:space="preserve"> 2027 – </w:t>
+            </w:r>
+            <w:r>
+              <w:rPr>
+                <w:szCs w:val="24"/>
+              </w:rPr>
+              <w:t>1</w:t>
+            </w:r>
+            <w:r>
+              <w:rPr>
+                <w:szCs w:val="24"/>
+              </w:rPr>
+              <w:t>4</w:t>
+            </w:r>
+            <w:r>
+              <w:rPr>
+                <w:szCs w:val="24"/>
+              </w:rPr>
+              <w:t xml:space="preserve"> Jan 2027</w:t>
             </w:r>
           </w:p>
         </w:tc>
@@ -1706,7 +1904,31 @@
               <w:rPr>
                 <w:szCs w:val="24"/>
               </w:rPr>
-              <w:t>25 Jan 2027 – 31 Jan 2027</w:t>
+              <w:t>1</w:t>
+            </w:r>
+            <w:r>
+              <w:rPr>
+                <w:szCs w:val="24"/>
+              </w:rPr>
+              <w:t>5</w:t>
+            </w:r>
+            <w:r>
+              <w:rPr>
+                <w:szCs w:val="24"/>
+              </w:rPr>
+              <w:t xml:space="preserve"> Jan 2027 – </w:t>
+            </w:r>
+            <w:r>
+              <w:rPr>
+                <w:szCs w:val="24"/>
+              </w:rPr>
+              <w:t>20</w:t>
+            </w:r>
+            <w:r>
+              <w:rPr>
+                <w:szCs w:val="24"/>
+              </w:rPr>
+              <w:t xml:space="preserve"> Jan 2027</w:t>
             </w:r>
           </w:p>
         </w:tc>
@@ -1772,7 +1994,37 @@
               <w:rPr>
                 <w:szCs w:val="24"/>
               </w:rPr>
-              <w:t>1 Feb 2027 – 7 Feb 2027</w:t>
+              <w:t>21</w:t>
+            </w:r>
+            <w:r>
+              <w:rPr>
+                <w:szCs w:val="24"/>
+              </w:rPr>
+              <w:t xml:space="preserve"> </w:t>
+            </w:r>
+            <w:r>
+              <w:rPr>
+                <w:szCs w:val="24"/>
+              </w:rPr>
+              <w:t>Jan</w:t>
+            </w:r>
+            <w:r>
+              <w:rPr>
+                <w:szCs w:val="24"/>
+              </w:rPr>
+              <w:t xml:space="preserve"> 2027 – </w:t>
+            </w:r>
+            <w:r>
+              <w:rPr>
+                <w:szCs w:val="24"/>
+              </w:rPr>
+              <w:t>30 Jan</w:t>
+            </w:r>
+            <w:r>
+              <w:rPr>
+                <w:szCs w:val="24"/>
+              </w:rPr>
+              <w:t xml:space="preserve"> 2027</w:t>
             </w:r>
           </w:p>
         </w:tc>
@@ -1802,7 +2054,7 @@
       <w:pPr>
         <w:pStyle w:val="Heading1"/>
       </w:pPr>
-      <w:bookmarkStart w:id="5" w:name="_Toc244019677"/>
+      <w:bookmarkStart w:id="5" w:name="_Toc244097719"/>
       <w:r>
         <w:t>6. Literature References</w:t>
       </w:r>
@@ -1938,7 +2190,7 @@
       <w:pPr>
         <w:pStyle w:val="Heading1"/>
       </w:pPr>
-      <w:bookmarkStart w:id="6" w:name="_Toc244019678"/>
+      <w:bookmarkStart w:id="6" w:name="_Toc244097720"/>
       <w:r>
         <w:t xml:space="preserve">7. Particulars of </w:t>
       </w:r>
@@ -1959,7 +2211,7 @@
       </w:tblPr>
       <w:tblGrid>
         <w:gridCol w:w="3264"/>
-        <w:gridCol w:w="3264"/>
+        <w:gridCol w:w="3287"/>
         <w:gridCol w:w="3264"/>
       </w:tblGrid>
       <w:tr>
@@ -2073,6 +2325,12 @@
                 <w:szCs w:val="24"/>
               </w:rPr>
             </w:pPr>
+            <w:r>
+              <w:rPr>
+                <w:szCs w:val="24"/>
+              </w:rPr>
+              <w:t>Apurva Deshpande</w:t>
+            </w:r>
           </w:p>
         </w:tc>
         <w:tc>
@@ -2087,6 +2345,12 @@
                 <w:szCs w:val="24"/>
               </w:rPr>
             </w:pPr>
+            <w:r>
+              <w:rPr>
+                <w:szCs w:val="24"/>
+              </w:rPr>
+              <w:t>Ram Panchal</w:t>
+            </w:r>
           </w:p>
         </w:tc>
       </w:tr>
@@ -2127,6 +2391,12 @@
                 <w:szCs w:val="24"/>
               </w:rPr>
             </w:pPr>
+            <w:r>
+              <w:rPr>
+                <w:szCs w:val="24"/>
+              </w:rPr>
+              <w:t>BE</w:t>
+            </w:r>
           </w:p>
         </w:tc>
         <w:tc>
@@ -2141,6 +2411,12 @@
                 <w:szCs w:val="24"/>
               </w:rPr>
             </w:pPr>
+            <w:r>
+              <w:rPr>
+                <w:szCs w:val="24"/>
+              </w:rPr>
+              <w:t>MCA</w:t>
+            </w:r>
           </w:p>
         </w:tc>
       </w:tr>
@@ -2181,6 +2457,12 @@
                 <w:szCs w:val="24"/>
               </w:rPr>
             </w:pPr>
+            <w:r>
+              <w:rPr>
+                <w:szCs w:val="24"/>
+              </w:rPr>
+              <w:t>Software Test Engineer</w:t>
+            </w:r>
           </w:p>
         </w:tc>
         <w:tc>
@@ -2195,6 +2477,12 @@
                 <w:szCs w:val="24"/>
               </w:rPr>
             </w:pPr>
+            <w:r>
+              <w:rPr>
+                <w:szCs w:val="24"/>
+              </w:rPr>
+              <w:t>Software Consultant</w:t>
+            </w:r>
           </w:p>
         </w:tc>
       </w:tr>
@@ -2235,6 +2523,12 @@
                 <w:szCs w:val="24"/>
               </w:rPr>
             </w:pPr>
+            <w:r>
+              <w:rPr>
+                <w:szCs w:val="24"/>
+              </w:rPr>
+              <w:t>Wipro Technologies, Pune</w:t>
+            </w:r>
           </w:p>
         </w:tc>
         <w:tc>
@@ -2249,6 +2543,12 @@
                 <w:szCs w:val="24"/>
               </w:rPr>
             </w:pPr>
+            <w:r>
+              <w:rPr>
+                <w:szCs w:val="24"/>
+              </w:rPr>
+              <w:t>Wipro Technologies, Pune</w:t>
+            </w:r>
           </w:p>
         </w:tc>
       </w:tr>
@@ -2289,6 +2589,12 @@
                 <w:szCs w:val="24"/>
               </w:rPr>
             </w:pPr>
+            <w:r>
+              <w:rPr>
+                <w:szCs w:val="24"/>
+              </w:rPr>
+              <w:t>8796143066</w:t>
+            </w:r>
           </w:p>
         </w:tc>
         <w:tc>
@@ -2303,6 +2609,12 @@
                 <w:szCs w:val="24"/>
               </w:rPr>
             </w:pPr>
+            <w:r>
+              <w:rPr>
+                <w:szCs w:val="24"/>
+              </w:rPr>
+              <w:t>9112299931</w:t>
+            </w:r>
           </w:p>
         </w:tc>
       </w:tr>
@@ -2343,6 +2655,12 @@
                 <w:szCs w:val="24"/>
               </w:rPr>
             </w:pPr>
+            <w:r>
+              <w:rPr>
+                <w:szCs w:val="24"/>
+              </w:rPr>
+              <w:t>apurva.deshpande@wipro.com</w:t>
+            </w:r>
           </w:p>
         </w:tc>
         <w:tc>
@@ -2357,6 +2675,12 @@
                 <w:szCs w:val="24"/>
               </w:rPr>
             </w:pPr>
+            <w:r>
+              <w:rPr>
+                <w:szCs w:val="24"/>
+              </w:rPr>
+              <w:t>ram.panchal@wipro.com</w:t>
+            </w:r>
           </w:p>
         </w:tc>
       </w:tr>
@@ -2386,7 +2710,7 @@
       <w:pPr>
         <w:pStyle w:val="Heading1"/>
       </w:pPr>
-      <w:bookmarkStart w:id="7" w:name="_Toc244019679"/>
+      <w:bookmarkStart w:id="7" w:name="_Toc244097721"/>
       <w:r>
         <w:lastRenderedPageBreak/>
         <w:t>8. Remarks of the Supervisor</w:t>
@@ -2461,27 +2785,25 @@
     </w:p>
     <w:p>
       <w:pPr>
-        <w:spacing w:before="0" w:after="60"/>
+        <w:spacing w:after="60"/>
         <w:jc w:val="center"/>
       </w:pPr>
       <w:r>
-        <w:rPr/>
         <w:t>Work Integrated Learning Programmes (WILP) Division</w:t>
       </w:r>
     </w:p>
     <w:p>
       <w:pPr>
-        <w:spacing w:before="0" w:after="240"/>
+        <w:spacing w:after="240"/>
         <w:jc w:val="center"/>
       </w:pPr>
       <w:r>
-        <w:rPr/>
         <w:t>First Semester of Academic Year 2026-2027</w:t>
       </w:r>
     </w:p>
     <w:p>
       <w:pPr>
-        <w:spacing w:before="0" w:after="240"/>
+        <w:spacing w:after="240"/>
         <w:jc w:val="center"/>
       </w:pPr>
       <w:r>
@@ -2499,13 +2821,16 @@
         <w:tblStyle w:val="TableGrid"/>
         <w:tblW w:w="0" w:type="auto"/>
         <w:jc w:val="center"/>
-        <w:tblLook w:val="04A0"/>
+        <w:tblLook w:val="04A0" w:firstRow="1" w:lastRow="0" w:firstColumn="1" w:lastColumn="0" w:noHBand="0" w:noVBand="1"/>
       </w:tblPr>
       <w:tblGrid>
         <w:gridCol w:w="3800"/>
         <w:gridCol w:w="5992"/>
       </w:tblGrid>
       <w:tr>
+        <w:trPr>
+          <w:jc w:val="center"/>
+        </w:trPr>
         <w:tc>
           <w:tcPr>
             <w:tcW w:w="3800" w:type="dxa"/>
@@ -2514,13 +2839,13 @@
           </w:tcPr>
           <w:p>
             <w:pPr>
-              <w:spacing w:before="0" w:after="40"/>
+              <w:spacing w:after="40"/>
             </w:pPr>
             <w:r>
               <w:rPr>
                 <w:b/>
               </w:rPr>
-              <w:t xml:space="preserve">STUDENT ID No.</w:t>
+              <w:t>STUDENT ID No.</w:t>
             </w:r>
           </w:p>
         </w:tc>
@@ -2531,16 +2856,18 @@
           </w:tcPr>
           <w:p>
             <w:pPr>
-              <w:spacing w:before="0" w:after="40"/>
+              <w:spacing w:after="40"/>
             </w:pPr>
             <w:r>
-              <w:rPr/>
-              <w:t/>
+              <w:t>2022wc15160</w:t>
             </w:r>
           </w:p>
         </w:tc>
       </w:tr>
       <w:tr>
+        <w:trPr>
+          <w:jc w:val="center"/>
+        </w:trPr>
         <w:tc>
           <w:tcPr>
             <w:tcW w:w="3800" w:type="dxa"/>
@@ -2549,7 +2876,7 @@
           </w:tcPr>
           <w:p>
             <w:pPr>
-              <w:spacing w:before="0" w:after="40"/>
+              <w:spacing w:after="40"/>
             </w:pPr>
             <w:r>
               <w:rPr>
@@ -2566,16 +2893,18 @@
           </w:tcPr>
           <w:p>
             <w:pPr>
-              <w:spacing w:before="0" w:after="40"/>
+              <w:spacing w:after="40"/>
             </w:pPr>
             <w:r>
-              <w:rPr/>
-              <w:t/>
+              <w:t>Bhagyashri Kiran Bhat</w:t>
             </w:r>
           </w:p>
         </w:tc>
       </w:tr>
       <w:tr>
+        <w:trPr>
+          <w:jc w:val="center"/>
+        </w:trPr>
         <w:tc>
           <w:tcPr>
             <w:tcW w:w="3800" w:type="dxa"/>
@@ -2584,7 +2913,7 @@
           </w:tcPr>
           <w:p>
             <w:pPr>
-              <w:spacing w:before="0" w:after="40"/>
+              <w:spacing w:after="40"/>
             </w:pPr>
             <w:r>
               <w:rPr>
@@ -2601,16 +2930,18 @@
           </w:tcPr>
           <w:p>
             <w:pPr>
-              <w:spacing w:before="0" w:after="40"/>
+              <w:spacing w:after="40"/>
             </w:pPr>
             <w:r>
-              <w:rPr/>
-              <w:t/>
+              <w:t>2022wc15160@wilp.bits-pilani.ac.in</w:t>
             </w:r>
           </w:p>
         </w:tc>
       </w:tr>
       <w:tr>
+        <w:trPr>
+          <w:jc w:val="center"/>
+        </w:trPr>
         <w:tc>
           <w:tcPr>
             <w:tcW w:w="3800" w:type="dxa"/>
@@ -2619,7 +2950,7 @@
           </w:tcPr>
           <w:p>
             <w:pPr>
-              <w:spacing w:before="0" w:after="40"/>
+              <w:spacing w:after="40"/>
             </w:pPr>
             <w:r>
               <w:rPr>
@@ -2636,16 +2967,21 @@
           </w:tcPr>
           <w:p>
             <w:pPr>
-              <w:spacing w:before="0" w:after="40"/>
+              <w:spacing w:after="40"/>
             </w:pPr>
             <w:r>
-              <w:rPr/>
-              <w:t/>
+              <w:rPr>
+                <w:szCs w:val="24"/>
+              </w:rPr>
+              <w:t>Wipro Technologies, Pune</w:t>
             </w:r>
           </w:p>
         </w:tc>
       </w:tr>
       <w:tr>
+        <w:trPr>
+          <w:jc w:val="center"/>
+        </w:trPr>
         <w:tc>
           <w:tcPr>
             <w:tcW w:w="3800" w:type="dxa"/>
@@ -2654,7 +2990,7 @@
           </w:tcPr>
           <w:p>
             <w:pPr>
-              <w:spacing w:before="0" w:after="40"/>
+              <w:spacing w:after="40"/>
             </w:pPr>
             <w:r>
               <w:rPr>
@@ -2671,16 +3007,18 @@
           </w:tcPr>
           <w:p>
             <w:pPr>
-              <w:spacing w:before="0" w:after="40"/>
+              <w:spacing w:after="40"/>
             </w:pPr>
             <w:r>
-              <w:rPr/>
-              <w:t/>
+              <w:t>Apurva Deshpande</w:t>
             </w:r>
           </w:p>
         </w:tc>
       </w:tr>
       <w:tr>
+        <w:trPr>
+          <w:jc w:val="center"/>
+        </w:trPr>
         <w:tc>
           <w:tcPr>
             <w:tcW w:w="3800" w:type="dxa"/>
@@ -2689,7 +3027,7 @@
           </w:tcPr>
           <w:p>
             <w:pPr>
-              <w:spacing w:before="0" w:after="40"/>
+              <w:spacing w:after="40"/>
             </w:pPr>
             <w:r>
               <w:rPr>
@@ -2706,16 +3044,21 @@
           </w:tcPr>
           <w:p>
             <w:pPr>
-              <w:spacing w:before="0" w:after="40"/>
+              <w:spacing w:after="40"/>
             </w:pPr>
             <w:r>
-              <w:rPr/>
-              <w:t/>
+              <w:rPr>
+                <w:szCs w:val="24"/>
+              </w:rPr>
+              <w:t>Wipro Technologies, Pune</w:t>
             </w:r>
           </w:p>
         </w:tc>
       </w:tr>
       <w:tr>
+        <w:trPr>
+          <w:jc w:val="center"/>
+        </w:trPr>
         <w:tc>
           <w:tcPr>
             <w:tcW w:w="3800" w:type="dxa"/>
@@ -2724,7 +3067,7 @@
           </w:tcPr>
           <w:p>
             <w:pPr>
-              <w:spacing w:before="0" w:after="40"/>
+              <w:spacing w:after="40"/>
             </w:pPr>
             <w:r>
               <w:rPr>
@@ -2741,16 +3084,18 @@
           </w:tcPr>
           <w:p>
             <w:pPr>
-              <w:spacing w:before="0" w:after="40"/>
+              <w:spacing w:after="40"/>
             </w:pPr>
             <w:r>
-              <w:rPr/>
-              <w:t/>
+              <w:t>apurva.deshpande@wipro.com</w:t>
             </w:r>
           </w:p>
         </w:tc>
       </w:tr>
       <w:tr>
+        <w:trPr>
+          <w:jc w:val="center"/>
+        </w:trPr>
         <w:tc>
           <w:tcPr>
             <w:tcW w:w="3800" w:type="dxa"/>
@@ -2759,7 +3104,7 @@
           </w:tcPr>
           <w:p>
             <w:pPr>
-              <w:spacing w:before="0" w:after="40"/>
+              <w:spacing w:after="40"/>
             </w:pPr>
             <w:r>
               <w:rPr>
@@ -2776,16 +3121,18 @@
           </w:tcPr>
           <w:p>
             <w:pPr>
-              <w:spacing w:before="0" w:after="40"/>
+              <w:spacing w:after="40"/>
             </w:pPr>
             <w:r>
-              <w:rPr/>
-              <w:t/>
+              <w:t>Ram Panchal</w:t>
             </w:r>
           </w:p>
         </w:tc>
       </w:tr>
       <w:tr>
+        <w:trPr>
+          <w:jc w:val="center"/>
+        </w:trPr>
         <w:tc>
           <w:tcPr>
             <w:tcW w:w="3800" w:type="dxa"/>
@@ -2794,7 +3141,7 @@
           </w:tcPr>
           <w:p>
             <w:pPr>
-              <w:spacing w:before="0" w:after="40"/>
+              <w:spacing w:after="40"/>
             </w:pPr>
             <w:r>
               <w:rPr>
@@ -2811,16 +3158,21 @@
           </w:tcPr>
           <w:p>
             <w:pPr>
-              <w:spacing w:before="0" w:after="40"/>
+              <w:spacing w:after="40"/>
             </w:pPr>
             <w:r>
-              <w:rPr/>
-              <w:t/>
+              <w:rPr>
+                <w:szCs w:val="24"/>
+              </w:rPr>
+              <w:t>Wipro Technologies, Pune</w:t>
             </w:r>
           </w:p>
         </w:tc>
       </w:tr>
       <w:tr>
+        <w:trPr>
+          <w:jc w:val="center"/>
+        </w:trPr>
         <w:tc>
           <w:tcPr>
             <w:tcW w:w="3800" w:type="dxa"/>
@@ -2829,7 +3181,7 @@
           </w:tcPr>
           <w:p>
             <w:pPr>
-              <w:spacing w:before="0" w:after="40"/>
+              <w:spacing w:after="40"/>
             </w:pPr>
             <w:r>
               <w:rPr>
@@ -2846,16 +3198,18 @@
           </w:tcPr>
           <w:p>
             <w:pPr>
-              <w:spacing w:before="0" w:after="40"/>
+              <w:spacing w:after="40"/>
             </w:pPr>
             <w:r>
-              <w:rPr/>
-              <w:t/>
+              <w:t>ram.panchal@wipro.com</w:t>
             </w:r>
           </w:p>
         </w:tc>
       </w:tr>
       <w:tr>
+        <w:trPr>
+          <w:jc w:val="center"/>
+        </w:trPr>
         <w:tc>
           <w:tcPr>
             <w:tcW w:w="3800" w:type="dxa"/>
@@ -2864,7 +3218,7 @@
           </w:tcPr>
           <w:p>
             <w:pPr>
-              <w:spacing w:before="0" w:after="40"/>
+              <w:spacing w:after="40"/>
             </w:pPr>
             <w:r>
               <w:rPr>
@@ -2881,10 +3235,9 @@
           </w:tcPr>
           <w:p>
             <w:pPr>
-              <w:spacing w:before="0" w:after="40"/>
+              <w:spacing w:after="40"/>
             </w:pPr>
             <w:r>
-              <w:rPr/>
               <w:t>Predictive CI/CD Reliability: Predicting Workflow Failures from Pre-Build Metadata</w:t>
             </w:r>
           </w:p>
@@ -2922,7 +3275,7 @@
           <w:insideH w:val="nil"/>
           <w:insideV w:val="nil"/>
         </w:tblBorders>
-        <w:tblLook w:val="04A0"/>
+        <w:tblLook w:val="04A0" w:firstRow="1" w:lastRow="0" w:firstColumn="1" w:lastColumn="0" w:noHBand="0" w:noVBand="1"/>
       </w:tblPr>
       <w:tblGrid>
         <w:gridCol w:w="3264"/>
@@ -2931,7 +3284,8 @@
       </w:tblGrid>
       <w:tr>
         <w:trPr>
-          <w:trHeight w:val="1100" w:hRule="atLeast"/>
+          <w:trHeight w:val="1100"/>
+          <w:jc w:val="center"/>
         </w:trPr>
         <w:tc>
           <w:tcPr>
@@ -2940,12 +3294,58 @@
           </w:tcPr>
           <w:p>
             <w:pPr>
-              <w:spacing w:before="0" w:after="40"/>
+              <w:spacing w:after="40"/>
               <w:jc w:val="center"/>
             </w:pPr>
             <w:r>
-              <w:rPr/>
-              <w:t/>
+              <w:rPr>
+                <w:noProof/>
+              </w:rPr>
+              <w:drawing>
+                <wp:inline distT="0" distB="0" distL="0" distR="0" wp14:anchorId="5D719461" wp14:editId="35EC4510">
+                  <wp:extent cx="1744980" cy="1310135"/>
+                  <wp:effectExtent l="0" t="0" r="7620" b="4445"/>
+                  <wp:docPr id="1267902490" name="Picture 2"/>
+                  <wp:cNvGraphicFramePr>
+                    <a:graphicFrameLocks xmlns:a="http://schemas.openxmlformats.org/drawingml/2006/main" noChangeAspect="1"/>
+                  </wp:cNvGraphicFramePr>
+                  <a:graphic xmlns:a="http://schemas.openxmlformats.org/drawingml/2006/main">
+                    <a:graphicData uri="http://schemas.openxmlformats.org/drawingml/2006/picture">
+                      <pic:pic xmlns:pic="http://schemas.openxmlformats.org/drawingml/2006/picture">
+                        <pic:nvPicPr>
+                          <pic:cNvPr id="0" name="Picture 2"/>
+                          <pic:cNvPicPr>
+                            <a:picLocks noChangeAspect="1" noChangeArrowheads="1"/>
+                          </pic:cNvPicPr>
+                        </pic:nvPicPr>
+                        <pic:blipFill>
+                          <a:blip r:embed="rId9">
+                            <a:extLst>
+                              <a:ext uri="{28A0092B-C50C-407E-A947-70E740481C1C}">
+                                <a14:useLocalDpi xmlns:a14="http://schemas.microsoft.com/office/drawing/2010/main" val="0"/>
+                              </a:ext>
+                            </a:extLst>
+                          </a:blip>
+                          <a:srcRect/>
+                          <a:stretch>
+                            <a:fillRect/>
+                          </a:stretch>
+                        </pic:blipFill>
+                        <pic:spPr bwMode="auto">
+                          <a:xfrm>
+                            <a:off x="0" y="0"/>
+                            <a:ext cx="1752804" cy="1316010"/>
+                          </a:xfrm>
+                          <a:prstGeom prst="rect">
+                            <a:avLst/>
+                          </a:prstGeom>
+                          <a:noFill/>
+                        </pic:spPr>
+                      </pic:pic>
+                    </a:graphicData>
+                  </a:graphic>
+                </wp:inline>
+              </w:drawing>
             </w:r>
           </w:p>
         </w:tc>
@@ -2956,12 +3356,48 @@
           </w:tcPr>
           <w:p>
             <w:pPr>
-              <w:spacing w:before="0" w:after="40"/>
+              <w:spacing w:after="40"/>
               <w:jc w:val="center"/>
             </w:pPr>
             <w:r>
-              <w:rPr/>
-              <w:t/>
+              <w:rPr>
+                <w:noProof/>
+              </w:rPr>
+              <w:drawing>
+                <wp:inline distT="0" distB="0" distL="0" distR="0" wp14:anchorId="168853C1" wp14:editId="19BD8CC0">
+                  <wp:extent cx="1417320" cy="890270"/>
+                  <wp:effectExtent l="0" t="0" r="0" b="5080"/>
+                  <wp:docPr id="1369196590" name="Picture 1"/>
+                  <wp:cNvGraphicFramePr>
+                    <a:graphicFrameLocks xmlns:a="http://schemas.openxmlformats.org/drawingml/2006/main" noChangeAspect="1"/>
+                  </wp:cNvGraphicFramePr>
+                  <a:graphic xmlns:a="http://schemas.openxmlformats.org/drawingml/2006/main">
+                    <a:graphicData uri="http://schemas.openxmlformats.org/drawingml/2006/picture">
+                      <pic:pic xmlns:pic="http://schemas.openxmlformats.org/drawingml/2006/picture">
+                        <pic:nvPicPr>
+                          <pic:cNvPr id="1369196590" name="Picture 1369196590"/>
+                          <pic:cNvPicPr/>
+                        </pic:nvPicPr>
+                        <pic:blipFill>
+                          <a:blip r:embed="rId10"/>
+                          <a:stretch>
+                            <a:fillRect/>
+                          </a:stretch>
+                        </pic:blipFill>
+                        <pic:spPr>
+                          <a:xfrm>
+                            <a:off x="0" y="0"/>
+                            <a:ext cx="1440978" cy="905130"/>
+                          </a:xfrm>
+                          <a:prstGeom prst="rect">
+                            <a:avLst/>
+                          </a:prstGeom>
+                        </pic:spPr>
+                      </pic:pic>
+                    </a:graphicData>
+                  </a:graphic>
+                </wp:inline>
+              </w:drawing>
             </w:r>
           </w:p>
         </w:tc>
@@ -2972,28 +3408,66 @@
           </w:tcPr>
           <w:p>
             <w:pPr>
-              <w:spacing w:before="0" w:after="40"/>
+              <w:spacing w:after="40"/>
               <w:jc w:val="center"/>
             </w:pPr>
             <w:r>
-              <w:rPr/>
-              <w:t/>
+              <w:rPr>
+                <w:noProof/>
+              </w:rPr>
+              <w:drawing>
+                <wp:inline distT="0" distB="0" distL="0" distR="0" wp14:anchorId="16EEFFA2" wp14:editId="10D36EF4">
+                  <wp:extent cx="1722120" cy="742876"/>
+                  <wp:effectExtent l="0" t="0" r="0" b="635"/>
+                  <wp:docPr id="73157485" name="Picture 3"/>
+                  <wp:cNvGraphicFramePr>
+                    <a:graphicFrameLocks xmlns:a="http://schemas.openxmlformats.org/drawingml/2006/main" noChangeAspect="1"/>
+                  </wp:cNvGraphicFramePr>
+                  <a:graphic xmlns:a="http://schemas.openxmlformats.org/drawingml/2006/main">
+                    <a:graphicData uri="http://schemas.openxmlformats.org/drawingml/2006/picture">
+                      <pic:pic xmlns:pic="http://schemas.openxmlformats.org/drawingml/2006/picture">
+                        <pic:nvPicPr>
+                          <pic:cNvPr id="73157485" name="Picture 73157485"/>
+                          <pic:cNvPicPr/>
+                        </pic:nvPicPr>
+                        <pic:blipFill>
+                          <a:blip r:embed="rId11"/>
+                          <a:stretch>
+                            <a:fillRect/>
+                          </a:stretch>
+                        </pic:blipFill>
+                        <pic:spPr>
+                          <a:xfrm>
+                            <a:off x="0" y="0"/>
+                            <a:ext cx="1773936" cy="765228"/>
+                          </a:xfrm>
+                          <a:prstGeom prst="rect">
+                            <a:avLst/>
+                          </a:prstGeom>
+                        </pic:spPr>
+                      </pic:pic>
+                    </a:graphicData>
+                  </a:graphic>
+                </wp:inline>
+              </w:drawing>
             </w:r>
           </w:p>
         </w:tc>
       </w:tr>
       <w:tr>
+        <w:trPr>
+          <w:jc w:val="center"/>
+        </w:trPr>
         <w:tc>
           <w:tcPr>
             <w:tcW w:w="3264" w:type="dxa"/>
             <w:tcBorders>
               <w:top w:val="single" w:sz="6" w:space="0" w:color="17365D"/>
             </w:tcBorders>
-            <w:vAlign w:val="top"/>
           </w:tcPr>
           <w:p>
             <w:pPr>
-              <w:spacing w:before="0" w:after="40"/>
+              <w:spacing w:after="40"/>
               <w:jc w:val="center"/>
             </w:pPr>
             <w:r>
@@ -3010,11 +3484,10 @@
             <w:tcBorders>
               <w:top w:val="single" w:sz="6" w:space="0" w:color="17365D"/>
             </w:tcBorders>
-            <w:vAlign w:val="top"/>
           </w:tcPr>
           <w:p>
             <w:pPr>
-              <w:spacing w:before="0" w:after="40"/>
+              <w:spacing w:after="40"/>
               <w:jc w:val="center"/>
             </w:pPr>
             <w:r>
@@ -3031,11 +3504,10 @@
             <w:tcBorders>
               <w:top w:val="single" w:sz="6" w:space="0" w:color="17365D"/>
             </w:tcBorders>
-            <w:vAlign w:val="top"/>
           </w:tcPr>
           <w:p>
             <w:pPr>
-              <w:spacing w:before="0" w:after="40"/>
+              <w:spacing w:after="40"/>
               <w:jc w:val="center"/>
             </w:pPr>
             <w:r>
@@ -3048,51 +3520,78 @@
         </w:tc>
       </w:tr>
       <w:tr>
+        <w:trPr>
+          <w:jc w:val="center"/>
+        </w:trPr>
         <w:tc>
           <w:tcPr>
             <w:tcW w:w="3264" w:type="dxa"/>
-            <w:vAlign w:val="top"/>
           </w:tcPr>
           <w:p>
             <w:pPr>
-              <w:spacing w:before="0" w:after="40"/>
+              <w:spacing w:after="40"/>
               <w:jc w:val="center"/>
             </w:pPr>
             <w:r>
-              <w:rPr/>
               <w:t>Name:</w:t>
+            </w:r>
+          </w:p>
+          <w:p>
+            <w:pPr>
+              <w:spacing w:after="40"/>
+              <w:jc w:val="center"/>
+            </w:pPr>
+            <w:r>
+              <w:t>Bhagyashri Pathak</w:t>
             </w:r>
           </w:p>
         </w:tc>
         <w:tc>
           <w:tcPr>
             <w:tcW w:w="3264" w:type="dxa"/>
-            <w:vAlign w:val="top"/>
           </w:tcPr>
           <w:p>
             <w:pPr>
-              <w:spacing w:before="0" w:after="40"/>
+              <w:spacing w:after="40"/>
               <w:jc w:val="center"/>
             </w:pPr>
             <w:r>
-              <w:rPr/>
               <w:t>Name:</w:t>
+            </w:r>
+          </w:p>
+          <w:p>
+            <w:pPr>
+              <w:spacing w:after="40"/>
+              <w:jc w:val="center"/>
+            </w:pPr>
+            <w:r>
+              <w:t>Apurva Deshpande</w:t>
+            </w:r>
+            <w:r>
+              <w:t xml:space="preserve"> </w:t>
             </w:r>
           </w:p>
         </w:tc>
         <w:tc>
           <w:tcPr>
             <w:tcW w:w="3264" w:type="dxa"/>
-            <w:vAlign w:val="top"/>
           </w:tcPr>
           <w:p>
             <w:pPr>
-              <w:spacing w:before="0" w:after="40"/>
+              <w:spacing w:after="40"/>
               <w:jc w:val="center"/>
             </w:pPr>
             <w:r>
-              <w:rPr/>
               <w:t>Name:</w:t>
+            </w:r>
+          </w:p>
+          <w:p>
+            <w:pPr>
+              <w:spacing w:after="40"/>
+              <w:jc w:val="center"/>
+            </w:pPr>
+            <w:r>
+              <w:t>Ram Panchal</w:t>
             </w:r>
           </w:p>
         </w:tc>
@@ -3100,8 +3599,8 @@
     </w:tbl>
     <w:p/>
     <w:sectPr>
-      <w:headerReference w:type="default" r:id="rId9"/>
-      <w:footerReference w:type="default" r:id="rId10"/>
+      <w:headerReference w:type="default" r:id="rId12"/>
+      <w:footerReference w:type="default" r:id="rId13"/>
       <w:pgSz w:w="12240" w:h="15840"/>
       <w:pgMar w:top="1037" w:right="1224" w:bottom="1037" w:left="1224" w:header="720" w:footer="720" w:gutter="0"/>
       <w:pgBorders w:offsetFrom="page">
@@ -4141,6 +4640,7 @@
   <w:style w:type="character" w:default="1" w:styleId="DefaultParagraphFont">
     <w:name w:val="Default Paragraph Font"/>
     <w:uiPriority w:val="1"/>
+    <w:semiHidden/>
     <w:unhideWhenUsed/>
   </w:style>
   <w:style w:type="table" w:default="1" w:styleId="TableNormal">

</xml_diff>